<commit_message>
docs(report): 同步 #53~#55 合并后的测试数据 (#19)
- 实验四：测试总览 21 类/100 用例，payment 6 类/36 用例，补 AfterSaleServiceIntegrationTest
- 实验四：F-20 卖家隔离由「不通过」改为「通过（#53 已修复）」，新增 F-26~F-28 售后用例
- 实验四：遗留问题 L-01 标记为已修复（#53，PR #70）
- 第五部分：自动化用例 90 -> 100，提交数 119 -> 130
- 会话交接：记录韬哥 #53~#55 合并与 #70 的验收过程

测试基线：main @ 915b44d，六服务 mvn test 全部 BUILD SUCCESS
</commit_message>
<xml_diff>
--- a/reports/实验四_测试与部署.docx
+++ b/reports/实验四_测试与部署.docx
@@ -1361,7 +1361,7 @@
           <w:rFonts w:ascii="Times New Roman" w:hAnsi="Times New Roman" w:eastAsia="宋体"/>
           <w:sz w:val="24"/>
         </w:rPr>
-        <w:t>六个后端模块共 20 个测试类、90 个测试用例，全部通过。</w:t>
+        <w:t>六个后端模块共 21 个测试类、100 个测试用例，全部通过。</w:t>
       </w:r>
       <w:r>
         <w:rPr>
@@ -1994,7 +1994,7 @@
                 <w:b w:val="0"/>
                 <w:sz w:val="21"/>
               </w:rPr>
-              <w:t xml:space="preserve">5</w:t>
+              <w:t>6</w:t>
             </w:r>
           </w:p>
         </w:tc>
@@ -2014,7 +2014,7 @@
                 <w:b w:val="0"/>
                 <w:sz w:val="21"/>
               </w:rPr>
-              <w:t xml:space="preserve">26</w:t>
+              <w:t>36</w:t>
             </w:r>
           </w:p>
         </w:tc>
@@ -2079,7 +2079,7 @@
                 <w:b w:val="0"/>
                 <w:sz w:val="21"/>
               </w:rPr>
-              <w:t>20</w:t>
+              <w:t>21</w:t>
             </w:r>
           </w:p>
         </w:tc>
@@ -2099,7 +2099,7 @@
                 <w:b w:val="0"/>
                 <w:sz w:val="21"/>
               </w:rPr>
-              <w:t>90</w:t>
+              <w:t>100</w:t>
             </w:r>
           </w:p>
         </w:tc>
@@ -3805,7 +3805,7 @@
           <w:bCs/>
           <w:sz w:val="24"/>
         </w:rPr>
-        <w:t xml:space="preserve">payment-service（26 个）</w:t>
+        <w:t>payment-service（36 个）</w:t>
       </w:r>
     </w:p>
     <w:p>
@@ -3948,7 +3948,7 @@
                 <w:b w:val="0"/>
                 <w:sz w:val="21"/>
               </w:rPr>
-              <w:t xml:space="preserve">PaymentCallbackIntegrationTest</w:t>
+              <w:t>PaymentCallbackIntegrationTest</w:t>
             </w:r>
           </w:p>
         </w:tc>
@@ -3968,7 +3968,7 @@
                 <w:b w:val="0"/>
                 <w:sz w:val="21"/>
               </w:rPr>
-              <w:t xml:space="preserve">8</w:t>
+              <w:t>9</w:t>
             </w:r>
           </w:p>
         </w:tc>
@@ -3988,7 +3988,7 @@
                 <w:b w:val="0"/>
                 <w:sz w:val="21"/>
               </w:rPr>
-              <w:t xml:space="preserve">回调验签、幂等去重、金额核对、状态更新</w:t>
+              <w:t>回调验签、幂等去重、金额核对、状态更新、同 tradeNo 10 次重复、6 线程并发重复、订单取消自动退款</w:t>
             </w:r>
           </w:p>
         </w:tc>
@@ -4078,7 +4078,7 @@
                 <w:b w:val="0"/>
                 <w:sz w:val="21"/>
               </w:rPr>
-              <w:t xml:space="preserve">RefundServiceIntegrationTest</w:t>
+              <w:t>RefundServiceIntegrationTest</w:t>
             </w:r>
           </w:p>
         </w:tc>
@@ -4098,7 +4098,7 @@
                 <w:b w:val="0"/>
                 <w:sz w:val="21"/>
               </w:rPr>
-              <w:t xml:space="preserve">6</w:t>
+              <w:t>8</w:t>
             </w:r>
           </w:p>
         </w:tc>
@@ -4118,7 +4118,7 @@
                 <w:b w:val="0"/>
                 <w:sz w:val="21"/>
               </w:rPr>
-              <w:t xml:space="preserve">退款申请、审核、超额退款拦截</w:t>
+              <w:t>退款申请、审核、超额退款拦截、卖家隔离、退款详情、历史 sellerId 补齐</w:t>
             </w:r>
           </w:p>
         </w:tc>
@@ -4208,7 +4208,7 @@
                 <w:b w:val="0"/>
                 <w:sz w:val="21"/>
               </w:rPr>
-              <w:t xml:space="preserve">PaymentPathIntegrationTest</w:t>
+              <w:t>PaymentPathIntegrationTest</w:t>
             </w:r>
           </w:p>
         </w:tc>
@@ -4228,7 +4228,7 @@
                 <w:b w:val="0"/>
                 <w:sz w:val="21"/>
               </w:rPr>
-              <w:t xml:space="preserve">2</w:t>
+              <w:t>3</w:t>
             </w:r>
           </w:p>
         </w:tc>
@@ -4248,7 +4248,72 @@
                 <w:b w:val="0"/>
                 <w:sz w:val="21"/>
               </w:rPr>
-              <w:t xml:space="preserve">接口路径双前缀兼容</w:t>
+              <w:t>接口路径双前缀兼容、退款列表、售后接口</w:t>
+            </w:r>
+          </w:p>
+        </w:tc>
+      </w:tr>
+      <w:tr>
+        <w:trPr>
+          <w:cantSplit/>
+        </w:trPr>
+        <w:tc>
+          <w:tcPr>
+            <w:tcW w:type="dxa" w:w="6122"/>
+          </w:tcPr>
+          <w:p>
+            <w:pPr>
+              <w:jc w:val="center"/>
+              <w:spacing w:before="30" w:after="30" w:line="240" w:lineRule="auto"/>
+              <w:ind w:firstLineChars="0" w:firstLine="0"/>
+            </w:pPr>
+            <w:r>
+              <w:rPr>
+                <w:rFonts w:ascii="Times New Roman" w:hAnsi="Times New Roman" w:eastAsia="宋体"/>
+                <w:b w:val="0"/>
+                <w:sz w:val="21"/>
+              </w:rPr>
+              <w:t>AfterSaleServiceIntegrationTest</w:t>
+            </w:r>
+          </w:p>
+        </w:tc>
+        <w:tc>
+          <w:tcPr>
+            <w:tcW w:type="dxa" w:w="820"/>
+          </w:tcPr>
+          <w:p>
+            <w:pPr>
+              <w:jc w:val="left"/>
+              <w:spacing w:before="30" w:after="30" w:line="240" w:lineRule="auto"/>
+              <w:ind w:firstLineChars="0" w:firstLine="0"/>
+            </w:pPr>
+            <w:r>
+              <w:rPr>
+                <w:rFonts w:ascii="Times New Roman" w:hAnsi="Times New Roman" w:eastAsia="宋体"/>
+                <w:b w:val="0"/>
+                <w:sz w:val="21"/>
+              </w:rPr>
+              <w:t>6</w:t>
+            </w:r>
+          </w:p>
+        </w:tc>
+        <w:tc>
+          <w:tcPr>
+            <w:tcW w:type="dxa" w:w="1913"/>
+          </w:tcPr>
+          <w:p>
+            <w:pPr>
+              <w:jc w:val="left"/>
+              <w:spacing w:before="30" w:after="30" w:line="240" w:lineRule="auto"/>
+              <w:ind w:firstLineChars="0" w:firstLine="0"/>
+            </w:pPr>
+            <w:r>
+              <w:rPr>
+                <w:rFonts w:ascii="Times New Roman" w:hAnsi="Times New Roman" w:eastAsia="宋体"/>
+                <w:b w:val="0"/>
+                <w:sz w:val="21"/>
+              </w:rPr>
+              <w:t>三类售后流程、权限、状态幂等</w:t>
             </w:r>
           </w:p>
         </w:tc>
@@ -6964,7 +7029,7 @@
                 <w:b w:val="0"/>
                 <w:sz w:val="21"/>
               </w:rPr>
-              <w:t xml:space="preserve">只能看到自己店的</w:t>
+              <w:t>只能看到自己店的</w:t>
             </w:r>
           </w:p>
         </w:tc>
@@ -6984,7 +7049,7 @@
                 <w:b w:val="0"/>
                 <w:sz w:val="21"/>
               </w:rPr>
-              <w:t xml:space="preserve">可见全平台</w:t>
+              <w:t>仅返回本店退款单</w:t>
             </w:r>
           </w:p>
         </w:tc>
@@ -7004,7 +7069,7 @@
                 <w:b w:val="0"/>
                 <w:sz w:val="21"/>
               </w:rPr>
-              <w:t xml:space="preserve">不通过，已记录</w:t>
+              <w:t>通过（#53 已修复）</w:t>
             </w:r>
           </w:p>
         </w:tc>
@@ -7630,6 +7695,381 @@
                 <w:sz w:val="21"/>
               </w:rPr>
               <w:t xml:space="preserve">通过</w:t>
+            </w:r>
+          </w:p>
+        </w:tc>
+      </w:tr>
+      <w:tr>
+        <w:trPr>
+          <w:cantSplit/>
+        </w:trPr>
+        <w:tc>
+          <w:tcPr>
+            <w:tcW w:type="dxa" w:w="1195"/>
+          </w:tcPr>
+          <w:p>
+            <w:pPr>
+              <w:jc w:val="center"/>
+              <w:spacing w:before="30" w:after="30" w:line="240" w:lineRule="auto"/>
+              <w:ind w:firstLineChars="0" w:firstLine="0"/>
+            </w:pPr>
+            <w:r>
+              <w:rPr>
+                <w:rFonts w:ascii="Times New Roman" w:hAnsi="Times New Roman" w:eastAsia="宋体"/>
+                <w:b w:val="0"/>
+                <w:sz w:val="21"/>
+              </w:rPr>
+              <w:t>F-26</w:t>
+            </w:r>
+          </w:p>
+        </w:tc>
+        <w:tc>
+          <w:tcPr>
+            <w:tcW w:type="dxa" w:w="1498"/>
+          </w:tcPr>
+          <w:p>
+            <w:pPr>
+              <w:jc w:val="left"/>
+              <w:spacing w:before="30" w:after="30" w:line="240" w:lineRule="auto"/>
+              <w:ind w:firstLineChars="0" w:firstLine="0"/>
+            </w:pPr>
+            <w:r>
+              <w:rPr>
+                <w:rFonts w:ascii="Times New Roman" w:hAnsi="Times New Roman" w:eastAsia="宋体"/>
+                <w:b w:val="0"/>
+                <w:sz w:val="21"/>
+              </w:rPr>
+              <w:t>申请仅退款售后</w:t>
+            </w:r>
+          </w:p>
+        </w:tc>
+        <w:tc>
+          <w:tcPr>
+            <w:tcW w:type="dxa" w:w="1076"/>
+          </w:tcPr>
+          <w:p>
+            <w:pPr>
+              <w:jc w:val="left"/>
+              <w:spacing w:before="30" w:after="30" w:line="240" w:lineRule="auto"/>
+              <w:ind w:firstLineChars="0" w:firstLine="0"/>
+            </w:pPr>
+            <w:r>
+              <w:rPr>
+                <w:rFonts w:ascii="Times New Roman" w:hAnsi="Times New Roman" w:eastAsia="宋体"/>
+                <w:b w:val="0"/>
+                <w:sz w:val="21"/>
+              </w:rPr>
+              <w:t>订单已支付</w:t>
+            </w:r>
+          </w:p>
+        </w:tc>
+        <w:tc>
+          <w:tcPr>
+            <w:tcW w:type="dxa" w:w="2112"/>
+          </w:tcPr>
+          <w:p>
+            <w:pPr>
+              <w:jc w:val="left"/>
+              <w:spacing w:before="30" w:after="30" w:line="240" w:lineRule="auto"/>
+              <w:ind w:firstLineChars="0" w:firstLine="0"/>
+            </w:pPr>
+            <w:r>
+              <w:rPr>
+                <w:rFonts w:ascii="Times New Roman" w:hAnsi="Times New Roman" w:eastAsia="宋体"/>
+                <w:b w:val="0"/>
+                <w:sz w:val="21"/>
+              </w:rPr>
+              <w:t>生成 REFUND_ONLY 售后单，卖家同意后走退款</w:t>
+            </w:r>
+          </w:p>
+        </w:tc>
+        <w:tc>
+          <w:tcPr>
+            <w:tcW w:type="dxa" w:w="2027"/>
+          </w:tcPr>
+          <w:p>
+            <w:pPr>
+              <w:jc w:val="left"/>
+              <w:spacing w:before="30" w:after="30" w:line="240" w:lineRule="auto"/>
+              <w:ind w:firstLineChars="0" w:firstLine="0"/>
+            </w:pPr>
+            <w:r>
+              <w:rPr>
+                <w:rFonts w:ascii="Times New Roman" w:hAnsi="Times New Roman" w:eastAsia="宋体"/>
+                <w:b w:val="0"/>
+                <w:sz w:val="21"/>
+              </w:rPr>
+              <w:t>售后单 PENDING → APPROVED → REFUNDED</w:t>
+            </w:r>
+          </w:p>
+        </w:tc>
+        <w:tc>
+          <w:tcPr>
+            <w:tcW w:type="dxa" w:w="948"/>
+          </w:tcPr>
+          <w:p>
+            <w:pPr>
+              <w:jc w:val="left"/>
+              <w:spacing w:before="30" w:after="30" w:line="240" w:lineRule="auto"/>
+              <w:ind w:firstLineChars="0" w:firstLine="0"/>
+            </w:pPr>
+            <w:r>
+              <w:rPr>
+                <w:rFonts w:ascii="Times New Roman" w:hAnsi="Times New Roman" w:eastAsia="宋体"/>
+                <w:b w:val="0"/>
+                <w:sz w:val="21"/>
+              </w:rPr>
+              <w:t>通过</w:t>
+            </w:r>
+          </w:p>
+        </w:tc>
+      </w:tr>
+      <w:tr>
+        <w:trPr>
+          <w:cantSplit/>
+        </w:trPr>
+        <w:tc>
+          <w:tcPr>
+            <w:tcW w:type="dxa" w:w="1195"/>
+          </w:tcPr>
+          <w:p>
+            <w:pPr>
+              <w:jc w:val="center"/>
+              <w:spacing w:before="30" w:after="30" w:line="240" w:lineRule="auto"/>
+              <w:ind w:firstLineChars="0" w:firstLine="0"/>
+            </w:pPr>
+            <w:r>
+              <w:rPr>
+                <w:rFonts w:ascii="Times New Roman" w:hAnsi="Times New Roman" w:eastAsia="宋体"/>
+                <w:b w:val="0"/>
+                <w:sz w:val="21"/>
+              </w:rPr>
+              <w:t>F-27</w:t>
+            </w:r>
+          </w:p>
+        </w:tc>
+        <w:tc>
+          <w:tcPr>
+            <w:tcW w:type="dxa" w:w="1498"/>
+          </w:tcPr>
+          <w:p>
+            <w:pPr>
+              <w:jc w:val="left"/>
+              <w:spacing w:before="30" w:after="30" w:line="240" w:lineRule="auto"/>
+              <w:ind w:firstLineChars="0" w:firstLine="0"/>
+            </w:pPr>
+            <w:r>
+              <w:rPr>
+                <w:rFonts w:ascii="Times New Roman" w:hAnsi="Times New Roman" w:eastAsia="宋体"/>
+                <w:b w:val="0"/>
+                <w:sz w:val="21"/>
+              </w:rPr>
+              <w:t>申请退货退款并按流程走完</w:t>
+            </w:r>
+          </w:p>
+        </w:tc>
+        <w:tc>
+          <w:tcPr>
+            <w:tcW w:type="dxa" w:w="1076"/>
+          </w:tcPr>
+          <w:p>
+            <w:pPr>
+              <w:jc w:val="left"/>
+              <w:spacing w:before="30" w:after="30" w:line="240" w:lineRule="auto"/>
+              <w:ind w:firstLineChars="0" w:firstLine="0"/>
+            </w:pPr>
+            <w:r>
+              <w:rPr>
+                <w:rFonts w:ascii="Times New Roman" w:hAnsi="Times New Roman" w:eastAsia="宋体"/>
+                <w:b w:val="0"/>
+                <w:sz w:val="21"/>
+              </w:rPr>
+              <w:t>订单已发货</w:t>
+            </w:r>
+          </w:p>
+        </w:tc>
+        <w:tc>
+          <w:tcPr>
+            <w:tcW w:type="dxa" w:w="2112"/>
+          </w:tcPr>
+          <w:p>
+            <w:pPr>
+              <w:jc w:val="left"/>
+              <w:spacing w:before="30" w:after="30" w:line="240" w:lineRule="auto"/>
+              <w:ind w:firstLineChars="0" w:firstLine="0"/>
+            </w:pPr>
+            <w:r>
+              <w:rPr>
+                <w:rFonts w:ascii="Times New Roman" w:hAnsi="Times New Roman" w:eastAsia="宋体"/>
+                <w:b w:val="0"/>
+                <w:sz w:val="21"/>
+              </w:rPr>
+              <w:t>买家回填物流，卖家确认收货后退款</w:t>
+            </w:r>
+          </w:p>
+        </w:tc>
+        <w:tc>
+          <w:tcPr>
+            <w:tcW w:type="dxa" w:w="2027"/>
+          </w:tcPr>
+          <w:p>
+            <w:pPr>
+              <w:jc w:val="left"/>
+              <w:spacing w:before="30" w:after="30" w:line="240" w:lineRule="auto"/>
+              <w:ind w:firstLineChars="0" w:firstLine="0"/>
+            </w:pPr>
+            <w:r>
+              <w:rPr>
+                <w:rFonts w:ascii="Times New Roman" w:hAnsi="Times New Roman" w:eastAsia="宋体"/>
+                <w:b w:val="0"/>
+                <w:sz w:val="21"/>
+              </w:rPr>
+              <w:t>BUYER_SHIPPED → SELLER_RECEIVED → REFUNDED</w:t>
+            </w:r>
+          </w:p>
+        </w:tc>
+        <w:tc>
+          <w:tcPr>
+            <w:tcW w:type="dxa" w:w="948"/>
+          </w:tcPr>
+          <w:p>
+            <w:pPr>
+              <w:jc w:val="left"/>
+              <w:spacing w:before="30" w:after="30" w:line="240" w:lineRule="auto"/>
+              <w:ind w:firstLineChars="0" w:firstLine="0"/>
+            </w:pPr>
+            <w:r>
+              <w:rPr>
+                <w:rFonts w:ascii="Times New Roman" w:hAnsi="Times New Roman" w:eastAsia="宋体"/>
+                <w:b w:val="0"/>
+                <w:sz w:val="21"/>
+              </w:rPr>
+              <w:t>通过</w:t>
+            </w:r>
+          </w:p>
+        </w:tc>
+      </w:tr>
+      <w:tr>
+        <w:trPr>
+          <w:cantSplit/>
+        </w:trPr>
+        <w:tc>
+          <w:tcPr>
+            <w:tcW w:type="dxa" w:w="1195"/>
+          </w:tcPr>
+          <w:p>
+            <w:pPr>
+              <w:jc w:val="center"/>
+              <w:spacing w:before="30" w:after="30" w:line="240" w:lineRule="auto"/>
+              <w:ind w:firstLineChars="0" w:firstLine="0"/>
+            </w:pPr>
+            <w:r>
+              <w:rPr>
+                <w:rFonts w:ascii="Times New Roman" w:hAnsi="Times New Roman" w:eastAsia="宋体"/>
+                <w:b w:val="0"/>
+                <w:sz w:val="21"/>
+              </w:rPr>
+              <w:t>F-28</w:t>
+            </w:r>
+          </w:p>
+        </w:tc>
+        <w:tc>
+          <w:tcPr>
+            <w:tcW w:type="dxa" w:w="1498"/>
+          </w:tcPr>
+          <w:p>
+            <w:pPr>
+              <w:jc w:val="left"/>
+              <w:spacing w:before="30" w:after="30" w:line="240" w:lineRule="auto"/>
+              <w:ind w:firstLineChars="0" w:firstLine="0"/>
+            </w:pPr>
+            <w:r>
+              <w:rPr>
+                <w:rFonts w:ascii="Times New Roman" w:hAnsi="Times New Roman" w:eastAsia="宋体"/>
+                <w:b w:val="0"/>
+                <w:sz w:val="21"/>
+              </w:rPr>
+              <w:t>同订单重复申请售后</w:t>
+            </w:r>
+          </w:p>
+        </w:tc>
+        <w:tc>
+          <w:tcPr>
+            <w:tcW w:type="dxa" w:w="1076"/>
+          </w:tcPr>
+          <w:p>
+            <w:pPr>
+              <w:jc w:val="left"/>
+              <w:spacing w:before="30" w:after="30" w:line="240" w:lineRule="auto"/>
+              <w:ind w:firstLineChars="0" w:firstLine="0"/>
+            </w:pPr>
+            <w:r>
+              <w:rPr>
+                <w:rFonts w:ascii="Times New Roman" w:hAnsi="Times New Roman" w:eastAsia="宋体"/>
+                <w:b w:val="0"/>
+                <w:sz w:val="21"/>
+              </w:rPr>
+              <w:t>已有进行中售后单</w:t>
+            </w:r>
+          </w:p>
+        </w:tc>
+        <w:tc>
+          <w:tcPr>
+            <w:tcW w:type="dxa" w:w="2112"/>
+          </w:tcPr>
+          <w:p>
+            <w:pPr>
+              <w:jc w:val="left"/>
+              <w:spacing w:before="30" w:after="30" w:line="240" w:lineRule="auto"/>
+              <w:ind w:firstLineChars="0" w:firstLine="0"/>
+            </w:pPr>
+            <w:r>
+              <w:rPr>
+                <w:rFonts w:ascii="Times New Roman" w:hAnsi="Times New Roman" w:eastAsia="宋体"/>
+                <w:b w:val="0"/>
+                <w:sz w:val="21"/>
+              </w:rPr>
+              <w:t>拒绝创建新售后单</w:t>
+            </w:r>
+          </w:p>
+        </w:tc>
+        <w:tc>
+          <w:tcPr>
+            <w:tcW w:type="dxa" w:w="2027"/>
+          </w:tcPr>
+          <w:p>
+            <w:pPr>
+              <w:jc w:val="left"/>
+              <w:spacing w:before="30" w:after="30" w:line="240" w:lineRule="auto"/>
+              <w:ind w:firstLineChars="0" w:firstLine="0"/>
+            </w:pPr>
+            <w:r>
+              <w:rPr>
+                <w:rFonts w:ascii="Times New Roman" w:hAnsi="Times New Roman" w:eastAsia="宋体"/>
+                <w:b w:val="0"/>
+                <w:sz w:val="21"/>
+              </w:rPr>
+              <w:t>返回「该订单已有进行中的售后单」</w:t>
+            </w:r>
+          </w:p>
+        </w:tc>
+        <w:tc>
+          <w:tcPr>
+            <w:tcW w:type="dxa" w:w="948"/>
+          </w:tcPr>
+          <w:p>
+            <w:pPr>
+              <w:jc w:val="left"/>
+              <w:spacing w:before="30" w:after="30" w:line="240" w:lineRule="auto"/>
+              <w:ind w:firstLineChars="0" w:firstLine="0"/>
+            </w:pPr>
+            <w:r>
+              <w:rPr>
+                <w:rFonts w:ascii="Times New Roman" w:hAnsi="Times New Roman" w:eastAsia="宋体"/>
+                <w:b w:val="0"/>
+                <w:sz w:val="21"/>
+              </w:rPr>
+              <w:t>通过</w:t>
             </w:r>
           </w:p>
         </w:tc>
@@ -9156,7 +9596,7 @@
           <w:rFonts w:ascii="Times New Roman" w:hAnsi="Times New Roman" w:eastAsia="宋体"/>
           <w:sz w:val="24"/>
         </w:rPr>
-        <w:t>自动化测试 90 个用例全部通过，覆盖鉴权、下单、支付、退款、配置、并发六个方面。</w:t>
+        <w:t>自动化测试 100 个用例全部通过，覆盖鉴权、下单、支付、退款、配置、并发六个方面。</w:t>
       </w:r>
     </w:p>
     <w:p>
@@ -10306,7 +10746,7 @@
                 <w:b w:val="0"/>
                 <w:sz w:val="21"/>
               </w:rPr>
-              <w:t xml:space="preserve">卖家退款列表无卖家过滤</w:t>
+              <w:t>卖家退款列表无卖家过滤</w:t>
             </w:r>
           </w:p>
         </w:tc>
@@ -10348,7 +10788,7 @@
                 <w:b w:val="0"/>
                 <w:sz w:val="21"/>
               </w:rPr>
-              <w:t xml:space="preserve">待修复（#53）</w:t>
+              <w:t>已修复（#53，PR #70）</w:t>
             </w:r>
           </w:p>
         </w:tc>

</xml_diff>